<commit_message>
docs(qa): update sequence diagrams, test docs/reports, and add Report6 user guide
</commit_message>
<xml_diff>
--- a/docs/qa/Chuan_Bi_Bao_Ve_1.1.docx
+++ b/docs/qa/Chuan_Bi_Bao_Ve_1.1.docx
@@ -183,7 +183,7 @@
         <w:spacing w:after="80"/>
       </w:pPr>
       <w:r>
-        <w:t xml:space="preserve">Có bộ test tự động (Vitest + Testing Library) với hơn 420 test case cho riêng phần Frontend, bao gồm cả test ghi chú lại những hành vi đúng-nhưng-dễ-hiểu-nhầm-là-bug để tránh sửa nhầm sau này.</w:t>
+        <w:t xml:space="preserve">Có bộ test tự động (Vitest + Testing Library) với 535 test case (100% pass ở lần chạy gần nhất) cho riêng phần Frontend, bao gồm cả test ghi chú lại những hành vi đúng-nhưng-dễ-hiểu-nhầm-là-bug để tránh sửa nhầm sau này.</w:t>
       </w:r>
     </w:p>
     <w:p>
@@ -2460,7 +2460,7 @@
         <w:spacing w:after="80"/>
       </w:pPr>
       <w:r>
-        <w:t xml:space="preserve">Có hơn 420 test case tự động (Vitest + Testing Library) cho phần Frontend, phủ cả các trường hợp “hành vi đúng nhưng dễ nhầm là bug” (ví dụ: nút hiện/ẩn mật khẩu ở ô Confirm biến mất khi hai mật khẩu khớp — hành vi có chủ đích, đã có test ghi chú rõ để tránh sửa nhầm về sau).</w:t>
+        <w:t xml:space="preserve">Có 535 test case (100% pass ở lần chạy gần nhất) tự động (Vitest + Testing Library) cho phần Frontend, phủ cả các trường hợp “hành vi đúng nhưng dễ nhầm là bug” (ví dụ: nút hiện/ẩn mật khẩu ở ô Confirm biến mất khi hai mật khẩu khớp — hành vi có chủ đích, đã có test ghi chú rõ để tránh sửa nhầm về sau).</w:t>
       </w:r>
     </w:p>
     <w:p>
@@ -3079,7 +3079,7 @@
         <w:t xml:space="preserve">8. QUAN TRỌNG NHẤT — Report 7, mục V. Software Testing Documentation HOÀN TOÀN TRỐNG: </w:t>
       </w:r>
       <w:r>
-        <w:t xml:space="preserve">Đã kiểm tra trực tiếp file Report 7 (Final Project Report): toàn bộ mục “V. Software Testing Documentation” chỉ có 18 tiêu đề con (Scope of Testing, Test Strategy, Test Plan, Test Cases, Test Reports, Test Statistics, Test Analysis, Conclusion...) mà KHÔNG có một dòng nội dung nào bên dưới — nhảy thẳng từ tiêu đề “5.3 Conclusion” sang mục VI tiếp theo. Đây là rủi ro nghiêm trọng nhất trong toàn bộ hồ sơ vì TC5 (Kiểm thử) đánh giá trực tiếp dựa trên tài liệu này. Bộ test tự động thật SỰ TỒN TẠI trong repository (hơn 420 test case, 64 file) — vấn đề là chưa được viết vào đúng chỗ trong Report 7, không phải chưa từng kiểm thử. BẮT BUỘC phải điền mục này trước ngày bảo vệ: nêu phạm vi test, chiến lược test, kế hoạch, danh sách/thống kê test case thật, và tỷ lệ pass/fail kèm nhật ký lỗi thật (dùng đúng danh sách lỗi đã liệt kê ở các mục hạn chế phía trên).</w:t>
+        <w:t xml:space="preserve">Đã kiểm tra trực tiếp file Report 7 (Final Project Report): toàn bộ mục “V. Software Testing Documentation” chỉ có 18 tiêu đề con (Scope of Testing, Test Strategy, Test Plan, Test Cases, Test Reports, Test Statistics, Test Analysis, Conclusion...) mà KHÔNG có một dòng nội dung nào bên dưới — nhảy thẳng từ tiêu đề “5.3 Conclusion” sang mục VI tiếp theo. Đây là rủi ro nghiêm trọng nhất trong toàn bộ hồ sơ vì TC5 (Kiểm thử) đánh giá trực tiếp dựa trên tài liệu này. Bộ test tự động thật SỰ TỒN TẠI trong repository (535 test case (100% pass ở lần chạy gần nhất), 64 file) — vấn đề là chưa được viết vào đúng chỗ trong Report 7, không phải chưa từng kiểm thử. BẮT BUỘC phải điền mục này trước ngày bảo vệ: nêu phạm vi test, chiến lược test, kế hoạch, danh sách/thống kê test case thật, và tỷ lệ pass/fail kèm nhật ký lỗi thật (dùng đúng danh sách lỗi đã liệt kê ở các mục hạn chế phía trên).</w:t>
       </w:r>
     </w:p>
     <w:p>
@@ -3263,6 +3263,103 @@
     </w:p>
     <w:p>
       <w:pPr>
+        <w:spacing w:after="140"/>
+        <w:jc w:val="both"/>
+      </w:pPr>
+      <w:r>
+        <w:rPr>
+          <w:b/>
+          <w:bCs/>
+        </w:rPr>
+        <w:t xml:space="preserve">Hỏi: Lỗi nghiêm trọng nhất nhóm từng gặp là gì? Phát hiện bằng cách nào và sửa ra sao?</w:t>
+      </w:r>
+    </w:p>
+    <w:p>
+      <w:pPr>
+        <w:spacing w:after="140"/>
+        <w:jc w:val="both"/>
+      </w:pPr>
+      <w:r>
+        <w:t xml:space="preserve">Trả lời gợi ý: Lỗi token refresh âm thầm lỗi (commit 8976041) khiến người dùng bị đăng xuất mỗi giờ dù access token lẽ ra refresh được — phát hiện qua kiểm thử một phiên đăng nhập kéo dài thay vì chỉ test nhanh vài phút, sửa bằng cách đảm bảo interceptor xử lý đúng luồng refresh. Đây chỉ là một trong hơn 10 lỗi thật đã tự phát hiện và tự sửa — danh sách đầy đủ kèm commit cụ thể nằm ở Phần IV của tài liệu Đóng góp cá nhân (Dong_Gop_Ca_Nhan_khoa3107.docx).</w:t>
+      </w:r>
+    </w:p>
+    <w:p>
+      <w:pPr>
+        <w:spacing w:after="140"/>
+        <w:jc w:val="both"/>
+      </w:pPr>
+      <w:r>
+        <w:rPr>
+          <w:b/>
+          <w:bCs/>
+        </w:rPr>
+        <w:t xml:space="preserve">Hỏi: Test report cho thấy tất cả đều pass — vậy trong suốt quá trình làm nhóm chưa từng ghi nhận lỗi nào?</w:t>
+      </w:r>
+    </w:p>
+    <w:p>
+      <w:pPr>
+        <w:spacing w:after="140"/>
+        <w:jc w:val="both"/>
+      </w:pPr>
+      <w:r>
+        <w:t xml:space="preserve">Trả lời gợi ý: Ngược lại — 535 test hiện tại pass chính là VÌ hơn 10 lỗi thật đã được tìm ra và sửa trong quá trình làm (ví dụ lỗi trên), có test khóa lại hành vi đúng để không tái phát, không phải vì chưa từng có lỗi. Cũng nên thẳng thắn nếu bị hỏi kỹ hơn: ở một lần chạy trước đó cùng ngày (17/08), đúng 1 test trong hr-dashboard.test.tsx từng fail do timeout chờ phần tử render, chạy lại thì pass — một ca kiểm thử chưa đủ ổn định (flaky), không phải lỗi logic sản phẩm.</w:t>
+      </w:r>
+    </w:p>
+    <w:p>
+      <w:pPr>
+        <w:spacing w:after="140"/>
+        <w:jc w:val="both"/>
+      </w:pPr>
+      <w:r>
+        <w:rPr>
+          <w:b/>
+          <w:bCs/>
+        </w:rPr>
+        <w:t xml:space="preserve">Hỏi: Hãy chạy lại test case số … ngay tại đây.</w:t>
+      </w:r>
+    </w:p>
+    <w:p>
+      <w:pPr>
+        <w:spacing w:after="140"/>
+        <w:jc w:val="both"/>
+      </w:pPr>
+      <w:r>
+        <w:t xml:space="preserve">Trả lời gợi ý: Chuẩn bị sẵn máy đã cài đủ dependency (npm install xong từ trước), chạy được ngay bằng npm run test -- -t "&lt;tên test&gt;" để lọc đúng 1 test case theo tên/mã khi được hội đồng chỉ định, thay vì chạy lại toàn bộ 535 test mất thời gian. Nên tập chạy thử lệnh này trước ít nhất một lần để không lúng túng thao tác ngay tại buổi.</w:t>
+      </w:r>
+    </w:p>
+    <w:p>
+      <w:pPr>
+        <w:spacing w:after="140"/>
+        <w:jc w:val="both"/>
+      </w:pPr>
+      <w:r>
+        <w:rPr>
+          <w:b/>
+          <w:bCs/>
+        </w:rPr>
+        <w:t xml:space="preserve">Hỏi: Nếu chỉ có tài liệu hướng dẫn trong tay, bước nào dễ mắc kẹt nhất khi cài đặt?</w:t>
+      </w:r>
+    </w:p>
+    <w:p>
+      <w:pPr>
+        <w:spacing w:after="140"/>
+        <w:jc w:val="both"/>
+      </w:pPr>
+      <w:r>
+        <w:t xml:space="preserve">Trả lời gợi ý: Bước dễ mắc kẹt nhất là đồng bộ INTERNAL_API_KEY giữa hai file cấu hình riêng biệt: RAG Service đọc từ .env (INTERNAL_API_KEY) còn Backend đọc từ appsettings (InternalApi:Key) — hai giá trị này phải khớp tuyệt đối, nhưng nằm ở hai nơi khác nhau nên rất dễ gõ sai hoặc quên cập nhật một bên, và khi sai thì lỗi hiện ra chỉ là 401 chung chung giữa hai service, không chỉ thẳng ra nguyên nhân là do key lệch. Theo sau là 2 bước cũng dễ bỏ sót: bật extension pgvector bằng tay (CREATE EXTENSION IF NOT EXISTS vector;) nếu dùng image postgres:16 thường thay vì image đã có sẵn pgvector; và pull đúng model Ollama theo đúng tên khai trong CHAT_MODEL/EMBEDDING_MODEL của .env — pull sai tên hoặc thiếu model sẽ khiến RAG Service khởi động được nhưng gọi sinh câu hỏi/embedding thì lỗi ở bước gọi model.</w:t>
+      </w:r>
+    </w:p>
+    <w:p>
+      <w:pPr>
+        <w:pStyle w:val="Heading2"/>
+        <w:spacing w:after="120" w:before="260"/>
+      </w:pPr>
+      <w:r>
+        <w:t xml:space="preserve">V.4. Quản trị dự án và trách nhiệm cá nhân</w:t>
+      </w:r>
+    </w:p>
+    <w:p>
+      <w:pPr>
         <w:pStyle w:val="ListParagraph"/>
         <w:numPr>
           <w:ilvl w:val="0"/>
@@ -3271,7 +3368,7 @@
         <w:spacing w:after="80"/>
       </w:pPr>
       <w:r>
-        <w:t xml:space="preserve">Lỗi nghiêm trọng nhất nhóm từng gặp là gì? Phát hiện bằng cách nào và sửa ra sao?</w:t>
+        <w:t xml:space="preserve">Nhóm đã trễ mốc nào trong kế hoạch? Nguyên nhân và cách xử lý?</w:t>
       </w:r>
     </w:p>
     <w:p>
@@ -3284,7 +3381,7 @@
         <w:spacing w:after="80"/>
       </w:pPr>
       <w:r>
-        <w:t xml:space="preserve">Test report cho thấy tất cả đều pass — vậy trong suốt quá trình làm nhóm chưa từng ghi nhận lỗi nào?</w:t>
+        <w:t xml:space="preserve">Bạn phụ trách phần nào? Hãy chỉ ra các commit tương ứng của bạn.</w:t>
       </w:r>
     </w:p>
     <w:p>
@@ -3297,67 +3394,6 @@
         <w:spacing w:after="80"/>
       </w:pPr>
       <w:r>
-        <w:t xml:space="preserve">Hãy chạy lại test case số … ngay tại đây.</w:t>
-      </w:r>
-    </w:p>
-    <w:p>
-      <w:pPr>
-        <w:pStyle w:val="ListParagraph"/>
-        <w:numPr>
-          <w:ilvl w:val="0"/>
-          <w:numId w:val="1"/>
-        </w:numPr>
-        <w:spacing w:after="80"/>
-      </w:pPr>
-      <w:r>
-        <w:t xml:space="preserve">Nếu chỉ có tài liệu hướng dẫn trong tay, bước nào dễ mắc kẹt nhất khi cài đặt?</w:t>
-      </w:r>
-    </w:p>
-    <w:p>
-      <w:pPr>
-        <w:pStyle w:val="Heading2"/>
-        <w:spacing w:after="120" w:before="260"/>
-      </w:pPr>
-      <w:r>
-        <w:t xml:space="preserve">V.4. Quản trị dự án và trách nhiệm cá nhân</w:t>
-      </w:r>
-    </w:p>
-    <w:p>
-      <w:pPr>
-        <w:pStyle w:val="ListParagraph"/>
-        <w:numPr>
-          <w:ilvl w:val="0"/>
-          <w:numId w:val="1"/>
-        </w:numPr>
-        <w:spacing w:after="80"/>
-      </w:pPr>
-      <w:r>
-        <w:t xml:space="preserve">Nhóm đã trễ mốc nào trong kế hoạch? Nguyên nhân và cách xử lý?</w:t>
-      </w:r>
-    </w:p>
-    <w:p>
-      <w:pPr>
-        <w:pStyle w:val="ListParagraph"/>
-        <w:numPr>
-          <w:ilvl w:val="0"/>
-          <w:numId w:val="1"/>
-        </w:numPr>
-        <w:spacing w:after="80"/>
-      </w:pPr>
-      <w:r>
-        <w:t xml:space="preserve">Bạn phụ trách phần nào? Hãy chỉ ra các commit tương ứng của bạn.</w:t>
-      </w:r>
-    </w:p>
-    <w:p>
-      <w:pPr>
-        <w:pStyle w:val="ListParagraph"/>
-        <w:numPr>
-          <w:ilvl w:val="0"/>
-          <w:numId w:val="1"/>
-        </w:numPr>
-        <w:spacing w:after="80"/>
-      </w:pPr>
-      <w:r>
         <w:t xml:space="preserve">Nếu được làm lại từ đầu, nhóm sẽ thay đổi điều gì lớn nhất?</w:t>
       </w:r>
     </w:p>
@@ -3741,7 +3777,7 @@
         <w:jc w:val="both"/>
       </w:pPr>
       <w:r>
-        <w:t xml:space="preserve">Trả lời gợi ý: Thừa nhận thẳng: mục này chưa được viết đầy đủ trong Report 7, đây là thiếu sót về tài liệu, không phải chưa từng kiểm thử — bộ test tự động thật có hơn 420 test case chạy bằng Vitest, có thể mở và chạy trực tiếp ngay tại đây để chứng minh. Sau buổi này nhóm sẽ bổ sung đầy đủ mục V theo đúng cấu trúc đã có sẵn tiêu đề.</w:t>
+        <w:t xml:space="preserve">Trả lời gợi ý: Thừa nhận thẳng: mục này chưa được viết đầy đủ trong Report 7, đây là thiếu sót về tài liệu, không phải chưa từng kiểm thử — bộ test tự động thật có 535 test case (100% pass ở lần chạy gần nhất) chạy bằng Vitest, có thể mở và chạy trực tiếp ngay tại đây để chứng minh. Sau buổi này nhóm sẽ bổ sung đầy đủ mục V theo đúng cấu trúc đã có sẵn tiêu đề.</w:t>
       </w:r>
     </w:p>
     <w:p>
@@ -3865,6 +3901,23 @@
     </w:p>
     <w:p>
       <w:pPr>
+        <w:shd w:fill="EAF7EE" w:val="clear"/>
+        <w:spacing w:after="160" w:before="120"/>
+        <w:ind w:left="200" w:right="200"/>
+      </w:pPr>
+      <w:r>
+        <w:rPr>
+          <w:b/>
+          <w:bCs/>
+        </w:rPr>
+        <w:t xml:space="preserve">Đã chạy thật: </w:t>
+      </w:r>
+      <w:r>
+        <w:t xml:space="preserve">Số liệu dưới đây lấy từ việc chạy trực tiếp npm run test:coverage trên máy vào ngày 17/08/2026, không phải ước lượng.</w:t>
+      </w:r>
+    </w:p>
+    <w:p>
+      <w:pPr>
         <w:spacing w:after="140"/>
         <w:jc w:val="both"/>
       </w:pPr>
@@ -3882,7 +3935,7 @@
         <w:jc w:val="both"/>
       </w:pPr>
       <w:r>
-        <w:t xml:space="preserve">Trả lời gợi ý: Hơn 420 test case khai báo trong 64 file (Vitest + Testing Library), chạy bằng lệnh npm run test — chuẩn bị sẵn máy đã cài dependency để chạy trực tiếp khi được yêu cầu, không chỉ đưa con số suông.</w:t>
+        <w:t xml:space="preserve">Trả lời gợi ý: 535 test case trong 64 file (Vitest + Testing Library), chạy bằng lệnh npm run test — toàn bộ 535 test PASS ở lần chạy gần nhất (17/08/2026), thời gian chạy khoảng 32 giây. Chuẩn bị sẵn máy đã cài dependency để chạy trực tiếp khi được yêu cầu.</w:t>
       </w:r>
     </w:p>
     <w:p>
@@ -3904,7 +3957,7 @@
         <w:jc w:val="both"/>
       </w:pPr>
       <w:r>
-        <w:t xml:space="preserve">Trả lời gợi ý: Có cả hai — ví dụ test cho trường hợp nhập sai định dạng, trường hợp hết quota, trường hợp một bộ câu hỏi đã publish thì khóa chỉnh sửa. Chuẩn bị sẵn 1-2 ví dụ test case ngoại lệ cụ thể để trích dẫn khi được hỏi trực tiếp, không trả lời chung chung “có ạ”.</w:t>
+        <w:t xml:space="preserve">Trả lời gợi ý: Có cả hai, với ví dụ thật có thể trích tên trực tiếp: RGA-SUB-1 (studio-flow.test.tsx) — kiểm tra khi generate trả về lỗi QUOTA_EXCEEDED thì mở đúng hộp thoại chặn, không phải toast; HIST-10 (question-set-history-table.tsx) — kiểm tra bộ câu hỏi đã PUBLISHED thì nút xóa bị khóa và không mở được hộp thoại xác nhận; AUTH005-2 (forgot-reset-password.test.tsx) — kiểm tra từ chối định dạng email không hợp lệ. Ngoài ra còn có nhóm test riêng cho lỗi tải dữ liệu kèm nút Retry (ví dụ ADASH-4, APS-2, ACOMP-4) và test cho lỗi 401/refresh token thất bại (RGA002-1, RGA019-1).</w:t>
       </w:r>
     </w:p>
     <w:p>
@@ -3926,7 +3979,7 @@
         <w:jc w:val="both"/>
       </w:pPr>
       <w:r>
-        <w:t xml:space="preserve">Trả lời gợi ý: Cần chạy npm run test:coverage để lấy con số chính xác trước ngày bảo vệ — đừng đưa ra một con số áng chừng không kiểm chứng được ngay tại buổi.</w:t>
+        <w:t xml:space="preserve">Trả lời gợi ý: Statements 58,26% (7.223/12.397) · Branches 49,96% (5.740/11.488) · Functions 52,92% (1.735/3.278) · Lines 61,43% (6.573/10.699). Coverage không đều giữa các module — một số phần lõi như candidate CV/profile, feedback, studio hooks phủ khá cao (70–100%), trong khi một số trang Admin và vài service ít test hơn (dưới 15%) — nên thừa nhận thẳng phần nào còn yếu nếu bị hỏi cụ thể, thay vì chỉ đưa 1 con số tổng.</w:t>
       </w:r>
     </w:p>
     <w:p>
@@ -3948,7 +4001,7 @@
         <w:jc w:val="both"/>
       </w:pPr>
       <w:r>
-        <w:t xml:space="preserve">Trả lời gợi ý: Ngược lại — dẫn thẳng danh sách 10 lỗi thật đã tự phát hiện và sửa (Phần IV của tài liệu Đóng góp cá nhân), ví dụ lỗi token refresh khiến bị đăng xuất mỗi giờ, hay dashboard từng hiển thị số liệu AI giả. Test hiện tại pass vì các lỗi đó ĐÃ được sửa và có test khóa lại hành vi đúng, không phải vì chưa từng có lỗi.</w:t>
+        <w:t xml:space="preserve">Trả lời gợi ý: Ngược lại — dẫn thẳng danh sách hơn 10 lỗi thật đã tự phát hiện và sửa (Phần IV của tài liệu Đóng góp cá nhân), ví dụ lỗi token refresh khiến bị đăng xuất mỗi giờ, hay dashboard từng hiển thị số liệu AI giả. Test hiện tại pass vì các lỗi đó ĐÃ được sửa và có test khóa lại hành vi đúng, không phải vì chưa từng có lỗi. Cũng nên thẳng thắn nếu bị hỏi kỹ hơn: ở một lần chạy trước đó cùng ngày, đúng 1 test (trong hr-dashboard.test.tsx) từng fail do timeout chờ phần tử render — chạy lại thì pass bình thường, tức là một ca kiểm thử chưa đủ ổn định (flaky) chứ không phải lỗi logic sản phẩm; nếu còn thời gian nên tăng timeout hoặc ổn định lại test đó trước ngày bảo vệ.</w:t>
       </w:r>
     </w:p>
     <w:p>
@@ -3970,7 +4023,7 @@
         <w:jc w:val="both"/>
       </w:pPr>
       <w:r>
-        <w:t xml:space="preserve">Trả lời gợi ý: Xác nhận chắc chắn được cho Frontend (hơn 420 test case Vitest). Backend/RAG do nằm ngoài phạm vi phần tự kiểm tra kỳ này — cần người phụ trách Backend/RAG xác nhận trực tiếp con số test bên đó, tránh nhận vơ số liệu không thuộc phần mình.</w:t>
+        <w:t xml:space="preserve">Trả lời gợi ý: Xác nhận chắc chắn được cho Frontend (535 test case Vitest, 64 file, 100% pass ở lần chạy gần nhất). Backend/RAG do nằm ngoài phạm vi phần tự kiểm tra kỳ này — cần người phụ trách Backend/RAG xác nhận trực tiếp con số test bên đó, tránh nhận vơ số liệu không thuộc phần mình.</w:t>
       </w:r>
     </w:p>
     <w:p>

</xml_diff>

<commit_message>
docs(qa): expand defense-prep Q&A, consolidate real product bugs, add test case explanation reference
- Chuan_Bi_Bao_Ve_1.1.docx: add Q&A on running/explaining arbitrary test cases, FE architecture, and the auth-refresh regression-test gap
- Dong_Gop_Ca_Nhan_khoa3107.docx: add score-polling race-condition bug and its test coverage note
- QA_Bug_Summary_Report: replace doc-generation tooling bugs with 28 real product bugs sourced from git history, noting which have regression tests
- Add Test_Case_Explanation_Reference (md + docx) documenting how to run/explain specific test files if drawn at random
</commit_message>
<xml_diff>
--- a/docs/qa/Chuan_Bi_Bao_Ve_1.1.docx
+++ b/docs/qa/Chuan_Bi_Bao_Ve_1.1.docx
@@ -3293,6 +3293,28 @@
           <w:b/>
           <w:bCs/>
         </w:rPr>
+        <w:t xml:space="preserve">Hỏi: Lỗi token refresh đó — sau khi sửa có viết test để tránh tái diễn không?</w:t>
+      </w:r>
+    </w:p>
+    <w:p>
+      <w:pPr>
+        <w:spacing w:after="140"/>
+        <w:jc w:val="both"/>
+      </w:pPr>
+      <w:r>
+        <w:t xml:space="preserve">Trả lời gợi ý: Có, RGA001-1 (tests/unit/auth-interceptor.test.ts) khoá đúng luồng: 401 → gọi /api/auth/refresh-token → nhận token mới → tự động retry request, không đăng xuất — đã tự chạy lại và pass thật. Nhưng cần thẳng thắn nếu bị hỏi sâu: nguyên nhân gốc của bug thật là giá trị SAI trong file .env (NEXT_PUBLIC_AUTH_REFRESH_PATH trỏ nhầm /auth/refresh thay vì /api/auth/refresh-token), tức lỗi cấu hình môi trường, không phải lỗi logic code. Trong khi đó RGA001-1 chạy trong môi trường test không set biến .env này nên luôn rơi vào giá trị mặc định đúng sẵn trong code (env.ts, getAuthRefreshPath() fallback "/api/auth/refresh-token") — nghĩa là test này khoá đúng LOGIC retry/refresh, chứ không khoá lại chính xác NGUYÊN NHÂN GỐC (giá trị cấu hình); nếu .env thật bị set sai lại, bộ test hiện tại sẽ không phát hiện ra. Đây là ranh giới rõ ràng giữa unit test cho logic và test cấu hình môi trường (loại sau thường không unit-test được mà cần kiểm tra ở bước deploy) — nên trả lời thẳng thắn thay vì nói test đã bao phủ 100%.</w:t>
+      </w:r>
+    </w:p>
+    <w:p>
+      <w:pPr>
+        <w:spacing w:after="140"/>
+        <w:jc w:val="both"/>
+      </w:pPr>
+      <w:r>
+        <w:rPr>
+          <w:b/>
+          <w:bCs/>
+        </w:rPr>
         <w:t xml:space="preserve">Hỏi: Test report cho thấy tất cả đều pass — vậy trong suốt quá trình làm nhóm chưa từng ghi nhận lỗi nào?</w:t>
       </w:r>
     </w:p>
@@ -3325,6 +3347,72 @@
       </w:pPr>
       <w:r>
         <w:t xml:space="preserve">Trả lời gợi ý: Chuẩn bị sẵn máy đã cài đủ dependency (npm install xong từ trước), chạy được ngay bằng npm run test -- -t "&lt;tên test&gt;" để lọc đúng 1 test case theo tên/mã khi được hội đồng chỉ định, thay vì chạy lại toàn bộ 535 test mất thời gian. Nên tập chạy thử lệnh này trước ít nhất một lần để không lúng túng thao tác ngay tại buổi.</w:t>
+      </w:r>
+    </w:p>
+    <w:p>
+      <w:pPr>
+        <w:spacing w:after="140"/>
+        <w:jc w:val="both"/>
+      </w:pPr>
+      <w:r>
+        <w:rPr>
+          <w:b/>
+          <w:bCs/>
+        </w:rPr>
+        <w:t xml:space="preserve">Hỏi: Nếu hội đồng chỉ định một test case bất kỳ, không báo trước, thì xử lý thế nào?</w:t>
+      </w:r>
+    </w:p>
+    <w:p>
+      <w:pPr>
+        <w:spacing w:after="140"/>
+        <w:jc w:val="both"/>
+      </w:pPr>
+      <w:r>
+        <w:t xml:space="preserve">Trả lời gợi ý: Có 3 tình huống: (1) Hội đồng đọc đúng mã QA-ID (VD "HIST-10") — mã này được nhúng ngay trong tên test ở code, nên chạy thẳng npm run test -- -t "HIST-10" là ra kết quả (đã tự kiểm chứng thực tế: 1/535 test chạy đúng và pass trong ~13 giây, chủ yếu là thời gian khởi động Vitest). (2) Hội đồng chỉ mô tả bằng lời, không đọc mã — dùng grep -rn "&lt;từ khóa tiếng Anh&gt;" tests/unit/ để tìm ra đúng file/dòng trước (VD grep mã HIST-10 hoặc RGA-SUB-1 ra đúng ngay tests/unit/hr-history.test.tsx:167 và tests/unit/studio-flow.test.tsx:144), rồi chạy -t như trên. (3) Test case đó không có coverage tự động hoặc thuộc phần Backend/RAG — trả lời thẳng là phần này kiểm thử thủ công/thuộc nhóm khác, không né tránh, rồi demo trực tiếp trên UI hoặc nhường lại cho đúng thành viên phụ trách. Điểm mấu chốt: luôn lọc theo TÊN (-t), không lọc theo tên FILE — lọc theo file rất dễ gõ sai (từng gõ nhầm "candidate-biling.test" thiếu 1 chữ "l", Vitest báo lỗi khá mơ hồ "No test files found, exiting with code 1"), trong khi mã QA-ID ngắn, không khoảng trắng, không cần nhớ đường dẫn nên an toàn hơn nhiều khi phải thao tác trực tiếp trước hội đồng.</w:t>
+      </w:r>
+    </w:p>
+    <w:p>
+      <w:pPr>
+        <w:spacing w:after="140"/>
+        <w:jc w:val="both"/>
+      </w:pPr>
+      <w:r>
+        <w:rPr>
+          <w:b/>
+          <w:bCs/>
+        </w:rPr>
+        <w:t xml:space="preserve">Hỏi: Nếu bị bắt giải thích từng test case (chứ không chỉ chạy) thì sao?</w:t>
+      </w:r>
+    </w:p>
+    <w:p>
+      <w:pPr>
+        <w:spacing w:after="140"/>
+        <w:jc w:val="both"/>
+      </w:pPr>
+      <w:r>
+        <w:t xml:space="preserve">Trả lời gợi ý: Không cần học thuộc — đọc trực tiếp từ nguồn có sẵn. (1) Ở mức nghiệp vụ: mỗi dòng trong SU26SE102-GSU26SE52_QA_TestCases.xlsx đã có sẵn Description/Procedure/Expected/Precondition, đọc thẳng ra là đủ. (2) Ở mức code: toàn bộ 535 test đều theo đúng 1 khuôn Arrange–Act–Assert nên chỉ cần thuộc pattern chung thay vì từng test — ví dụ AUTH005-2 (tests/unit/forgot-reset-password.test.tsx:52-59): Arrange dựng component thật (renderWithProviders), Act mô phỏng thao tác người dùng thật qua Testing Library (type email sai định dạng rồi click nút gửi) chứ không gọi thẳng hàm nội bộ, Assert kiểm tra cả 2 chiều — thông báo lỗi hiển thị đúng VÀ API forgotPassword không hề bị gọi khi input sai, tức test khoá đúng luồng validation chặn trước khi ra network chứ không chỉ check giao diện. Nguyên tắc mock: chỉ mock ở ranh giới gọi API/network để test nhanh và ổn định, phần còn lại (render, tương tác, state) đều là component thật nên phản ánh đúng hành vi người dùng. Mỗi file test còn có comment đầu file ghi rõ nó "grounded in" đúng file source nào và map sang đúng sheet Excel nào (VD AUTH005_ForgotResetPassword) — là bằng chứng truy vết trực tiếp nếu bị hỏi "sao biết test này đúng yêu cầu". Nếu gặp 1 test cụ thể không nhớ ngay, được phép mở file tra theo mã QA-ID rồi giải thích trực tiếp tại chỗ — không cần thuộc lòng cả 535 test; nên chọn trước 5-10 test tiêu biểu (mỗi nhóm nghiệp vụ 1-2 cái) để giải thích trôi chảy không cần mở file, phần còn lại tra cứu live là đủ.</w:t>
+      </w:r>
+    </w:p>
+    <w:p>
+      <w:pPr>
+        <w:spacing w:after="140"/>
+        <w:jc w:val="both"/>
+      </w:pPr>
+      <w:r>
+        <w:rPr>
+          <w:b/>
+          <w:bCs/>
+        </w:rPr>
+        <w:t xml:space="preserve">Hỏi: Ví dụ cụ thể: giải thích file tests/unit/history-published-set.test.tsx.</w:t>
+      </w:r>
+    </w:p>
+    <w:p>
+      <w:pPr>
+        <w:spacing w:after="140"/>
+        <w:jc w:val="both"/>
+      </w:pPr>
+      <w:r>
+        <w:t xml:space="preserve">Trả lời gợi ý: File này có 3 test case, đã tự chạy lại và cả 3 đều pass (npm run test -- -t "RAG028"). Sheet Excel tương ứng: RAG028 (published-set edit restrictions), map với biến isLocked = publishStatus === "PUBLISHED" trong review-questions-section.tsx. RAG028-1: một set đã PUBLISHED thì khoá toàn bộ Add/Edit/Delete/Reorder — hiện dòng cảnh báo khoá, ẩn nút "Add Question", và mỗi câu hỏi riêng lẻ cũng không còn nút Delete. RAG028-2: một set còn DRAFT thì sửa bình thường — không cảnh báo, còn "Add Question", mỗi câu hỏi vẫn có Delete (2 câu × 2 action bar desktop/mobile = 4 nút). RAG028-3: ngoại lệ có chủ đích — dù set đã PUBLISHED, HR vẫn được sửa time limit của bài thi, vì thời gian làm bài của phiên đang chạy được chốt server-side lúc bắt đầu (expiresAt), đổi timeLimitMinutes sau đó không ảnh hưởng phiên đang thi, nên control này được exempt khỏi isLocked. Lưu ý dễ nhầm: mã RAG028 (file này, kiểm tra khoá Add/Edit/Delete/Reorder ở trang review chi tiết per-question) là MỘT MÃ KHÁC với HIST-10 (tests/unit/hr-history.test.tsx:167, kiểm tra nút Delete bị khoá ở trang danh sách lịch sử list-level) — hai lớp bảo vệ riêng biệt cho cùng một business rule "không được sửa/xoá set đã publish", không phải trùng lặp.</w:t>
       </w:r>
     </w:p>
     <w:p>

</xml_diff>